<commit_message>
Auto sync 2026-06-03 16:25:53
</commit_message>
<xml_diff>
--- a/杭州楼市26年物料/2026年杭州各区县学区分类.docx
+++ b/杭州楼市26年物料/2026年杭州各区县学区分类.docx
@@ -3,6 +3,17 @@
 <w:document xmlns:wpc="http://schemas.microsoft.com/office/word/2010/wordprocessingCanvas" xmlns:mc="http://schemas.openxmlformats.org/markup-compatibility/2006" xmlns:o="urn:schemas-microsoft-com:office:office" xmlns:r="http://schemas.openxmlformats.org/officeDocument/2006/relationships" xmlns:m="http://schemas.openxmlformats.org/officeDocument/2006/math" xmlns:v="urn:schemas-microsoft-com:vml" xmlns:wp14="http://schemas.microsoft.com/office/word/2010/wordprocessingDrawing" xmlns:wp="http://schemas.openxmlformats.org/drawingml/2006/wordprocessingDrawing" xmlns:w="http://schemas.openxmlformats.org/wordprocessingml/2006/main" xmlns:w14="http://schemas.microsoft.com/office/word/2010/wordml" xmlns:w10="urn:schemas-microsoft-com:office:word" xmlns:w15="http://schemas.microsoft.com/office/word/2012/wordml" xmlns:wpg="http://schemas.microsoft.com/office/word/2010/wordprocessingGroup" xmlns:wpi="http://schemas.microsoft.com/office/word/2010/wordprocessingInk" xmlns:wne="http://schemas.microsoft.com/office/word/2006/wordml" xmlns:wps="http://schemas.microsoft.com/office/word/2010/wordprocessingShape" xmlns:wpsCustomData="http://www.wps.cn/officeDocument/2013/wpsCustomData" mc:Ignorable="w14 w15 wp14">
   <w:body>
     <w:p>
+      <w:r>
+        <w:rPr>
+          <w:rFonts w:ascii="Microsoft YaHei" w:hAnsi="Microsoft YaHei" w:eastAsia="Microsoft YaHei"/>
+          <w:b/>
+          <w:color w:val="1F4E79"/>
+          <w:sz w:val="30"/>
+        </w:rPr>
+        <w:t>2026年杭州各区县学区分类</w:t>
+      </w:r>
+    </w:p>
+    <w:p>
       <w:pPr>
         <w:pStyle w:val="2"/>
         <w:keepNext w:val="0"/>
@@ -11,7 +22,13 @@
         <w:suppressLineNumbers w:val="0"/>
       </w:pPr>
       <w:r>
-        <w:t>2026年杭州各区县学区分类</w:t>
+        <w:rPr>
+          <w:rFonts w:ascii="Microsoft YaHei" w:hAnsi="Microsoft YaHei" w:eastAsia="Microsoft YaHei"/>
+          <w:b/>
+          <w:color w:val="C00000"/>
+          <w:sz w:val="20"/>
+        </w:rPr>
+        <w:t>【联网校正】截至2026-06-03，本文件的学校名单和预警信息保留为选房线索；学区划片、红黄预警、落户年限和一表生规则以各区教育局当年招生公告为准。购买学区房前必须核验房户一致、学位占用、户口迁出和近年调剂情况。</w:t>
       </w:r>
     </w:p>
     <w:p>

</xml_diff>